<commit_message>
Frame inspector + export, and fix hop-UI sync / scan channel-restore
Frame inspector (new): every captured frame now stores its raw MPDU (packets.raw,
migrated, with retention). Clicking a live frame opens a drawer with a full
layer-by-layer decode (/api/decode → MAC/NWK/APS/ZCL), resolved names + IEEE, and
a hex dump; Copy hex / Export JSON from the drawer. Raw hex added to the frame WS
event and /api/frames seed.

Bug fixes reported from the field:
- Config "Channel Hopping" input was hardcoded value=0 and never synced to the
  device — so it read 0 while the radio actually hopped at 60 ms. Now it reflects
  the live hop_dwell_ms from status.
- Survey/monitor "restored channel N" used the momentary (mid-hop) channel. They
  now restore to the CONFIGURED channel + hop state (Server.Channel/HopDwell), and
  disable hopping during the sweep so it's clean.

Docs: user-guide (frame inspector) + api.md (/api/decode) + docx.

Co-Authored-By: Claude Opus 4.8 <noreply@anthropic.com>
</commit_message>
<xml_diff>
--- a/docs/user-guide.docx
+++ b/docs/user-guide.docx
@@ -1103,6 +1103,54 @@
       </w:r>
       <w:r>
         <w:t>).</w:t>
+      </w:r>
+    </w:p>
+    <w:p>
+      <w:pPr>
+        <w:pStyle w:val="ListBullet"/>
+      </w:pPr>
+      <w:r>
+        <w:rPr>
+          <w:b/>
+        </w:rPr>
+        <w:t>Click any frame</w:t>
+      </w:r>
+      <w:r>
+        <w:t xml:space="preserve"> to open the </w:t>
+      </w:r>
+      <w:r>
+        <w:rPr>
+          <w:b/>
+        </w:rPr>
+        <w:t>inspector</w:t>
+      </w:r>
+      <w:r>
+        <w:t>: a layer-by-layer decode (MAC / NWK / APS / ZCL),</w:t>
+      </w:r>
+    </w:p>
+    <w:p>
+      <w:r>
+        <w:t xml:space="preserve">  the resolved device name and IEEE address, and a raw hex dump. </w:t>
+      </w:r>
+      <w:r>
+        <w:rPr>
+          <w:b/>
+        </w:rPr>
+        <w:t>Copy hex</w:t>
+      </w:r>
+      <w:r>
+        <w:t xml:space="preserve"> or </w:t>
+      </w:r>
+      <w:r>
+        <w:rPr>
+          <w:b/>
+        </w:rPr>
+        <w:t>Export JSON</w:t>
+      </w:r>
+    </w:p>
+    <w:p>
+      <w:r>
+        <w:t xml:space="preserve">  (the full decode + metadata) from the drawer.</w:t>
       </w:r>
     </w:p>
     <w:p>

</xml_diff>

<commit_message>
Add pcap export for Wireshark (802.15.4 TAP)
/api/export?what=frames&format=pcap streams a classic pcap with linktype
LINKTYPE_IEEE802_15_4_TAP (283): per-frame TAP TLVs (FCS type, channel, RSSI as
float dBm, LQI) followed by the raw MPDU, oldest-first. UI: a "Frames → pcap"
button in the Export row.

Verified: valid pcap magic/linktype, correct TLVs (ch 20, RSS -69 dBm, LQI 11)
and a well-formed 802.15.4 data frame (FCF 0x8841) across 2245 packets.

Docs: user-guide + api.md.

Co-Authored-By: Claude Opus 4.8 <noreply@anthropic.com>
</commit_message>
<xml_diff>
--- a/docs/user-guide.docx
+++ b/docs/user-guide.docx
@@ -2394,7 +2394,30 @@
         <w:t>Export</w:t>
       </w:r>
       <w:r>
-        <w:t xml:space="preserve"> — download Devices / Frames / Incidents / Diagnostics / Spectrum as CSV or JSON.</w:t>
+        <w:t xml:space="preserve"> — download Devices / Frames / Incidents / Diagnostics / Spectrum as CSV or JSON, or</w:t>
+      </w:r>
+    </w:p>
+    <w:p>
+      <w:r>
+        <w:t xml:space="preserve">  </w:t>
+      </w:r>
+      <w:r>
+        <w:rPr>
+          <w:b/>
+        </w:rPr>
+        <w:t>Frames → pcap</w:t>
+      </w:r>
+      <w:r>
+        <w:t xml:space="preserve"> for </w:t>
+      </w:r>
+      <w:r>
+        <w:rPr>
+          <w:b/>
+        </w:rPr>
+        <w:t>Wireshark</w:t>
+      </w:r>
+      <w:r>
+        <w:t xml:space="preserve"> (802.15.4 TAP encapsulation, with per-frame RSSI/LQI/channel).</w:t>
       </w:r>
     </w:p>
     <w:p>

</xml_diff>

<commit_message>
Hopping warning banner + on-demand re-interview (safe, no TX)
- Header shows a "⚠ channel-hopping" badge whenever hop_dwell_ms > 0 (the radio
  isn't pinned, so your network is only captured part of the time). Click it to
  pin back to your channel (/api/hop?dwell=0).
- Device drawer "Re-interview" button forces an immediate re-pull of the device's
  capabilities/neighbours from the coordinator (HAManager.Refresh →
  /api/reinterview). Uses ZHA's own data — nothing transmits on the network.

Docs: user-guide + regenerated docx.

Co-Authored-By: Claude Opus 4.8 <noreply@anthropic.com>
</commit_message>
<xml_diff>
--- a/docs/user-guide.docx
+++ b/docs/user-guide.docx
@@ -947,7 +947,16 @@
     </w:p>
     <w:p>
       <w:r>
-        <w:t xml:space="preserve">on-air interrogation) and a </w:t>
+        <w:t xml:space="preserve">on-air interrogation; </w:t>
+      </w:r>
+      <w:r>
+        <w:rPr>
+          <w:b/>
+        </w:rPr>
+        <w:t>Re-interview</w:t>
+      </w:r>
+      <w:r>
+        <w:t xml:space="preserve"> re-pulls it on demand) and a </w:t>
       </w:r>
       <w:r>
         <w:rPr>
@@ -955,13 +964,34 @@
         </w:rPr>
         <w:t>Path from coordinator</w:t>
       </w:r>
-      <w:r>
-        <w:t xml:space="preserve"> button that plots the route to the device</w:t>
-      </w:r>
     </w:p>
     <w:p>
       <w:r>
-        <w:t>hop-by-hop with per-hop LQI (from ZHA's neighbour table, or the sniffer's observed links).</w:t>
+        <w:t>button that plots the route to the device hop-by-hop with per-hop LQI (from ZHA's neighbour table,</w:t>
+      </w:r>
+    </w:p>
+    <w:p>
+      <w:r>
+        <w:t>or the sniffer's observed links).</w:t>
+      </w:r>
+    </w:p>
+    <w:p>
+      <w:r>
+        <w:t xml:space="preserve">A </w:t>
+      </w:r>
+      <w:r>
+        <w:rPr>
+          <w:b/>
+        </w:rPr>
+        <w:t>⚠ channel-hopping</w:t>
+      </w:r>
+      <w:r>
+        <w:t xml:space="preserve"> badge appears in the top bar whenever the radio is hopping (which only</w:t>
+      </w:r>
+    </w:p>
+    <w:p>
+      <w:r>
+        <w:t>captures your network part of the time) — click it to pin back to your channel.</w:t>
       </w:r>
     </w:p>
     <w:p>

</xml_diff>